<commit_message>
Finalize Objective 3 presentation package
</commit_message>
<xml_diff>
--- a/reports/objective3_demonstration/Objectif3_guide_utilisation.docx
+++ b/reports/objective3_demonstration/Objectif3_guide_utilisation.docx
@@ -44,7 +44,7 @@
           <w:color w:val="1F4D78"/>
           <w:sz w:val="22"/>
         </w:rPr>
-        <w:t xml:space="preserve">Livrables : </w:t>
+        <w:t xml:space="preserve">Livrables SOW : </w:t>
       </w:r>
       <w:r>
         <w:rPr>
@@ -54,7 +54,32 @@
           <w:color w:val="202124"/>
           <w:sz w:val="22"/>
         </w:rPr>
-        <w:t>notebook final, documentation et sorties de démonstration</w:t>
+        <w:t>notebook final et documentation</w:t>
+      </w:r>
+    </w:p>
+    <w:p>
+      <w:pPr>
+        <w:spacing w:after="120"/>
+      </w:pPr>
+      <w:r>
+        <w:rPr>
+          <w:rFonts w:ascii="Calibri" w:hAnsi="Calibri"/>
+          <w:b/>
+          <w:i w:val="0"/>
+          <w:color w:val="1F4D78"/>
+          <w:sz w:val="22"/>
+        </w:rPr>
+        <w:t xml:space="preserve">Supports inclus : </w:t>
+      </w:r>
+      <w:r>
+        <w:rPr>
+          <w:rFonts w:ascii="Calibri" w:hAnsi="Calibri"/>
+          <w:b w:val="0"/>
+          <w:i w:val="0"/>
+          <w:color w:val="202124"/>
+          <w:sz w:val="22"/>
+        </w:rPr>
+        <w:t>données compactes, sorties et présentation détaillée</w:t>
       </w:r>
     </w:p>
     <w:p>
@@ -1333,7 +1358,7 @@
                 <w:color w:val="202124"/>
                 <w:sz w:val="18"/>
               </w:rPr>
-              <w:t>présent guide Word</w:t>
+              <w:t>guide Word et présentation détaillée</w:t>
             </w:r>
           </w:p>
         </w:tc>

</xml_diff>